<commit_message>
fix data quality numbers and payments relationship in docx, remove stale sandbox paths
</commit_message>
<xml_diff>
--- a/docs/ASG_Airlines_Documentation.docx
+++ b/docs/ASG_Airlines_Documentation.docx
@@ -84,6 +84,14 @@
       </w:pPr>
       <w:r>
         <w:t xml:space="preserve">The pipeline follows a straightforward ingest → clean → store → visualize flow. Everything runs as a single Python script for this assignment, but each stage is a separate function so it could be lifted into Azure Data Factory / Databricks activities later without restructuring the logic.</w:t>
+      </w:r>
+    </w:p>
+    <w:p>
+      <w:pPr>
+        <w:spacing w:after="160"/>
+      </w:pPr>
+      <w:r>
+        <w:t xml:space="preserve">At this volume (~1,000 rows per table), pandas in memory is the right call — it's simple to read, debug, and rerun. It wouldn't scale past that as-is: the cleaning functions would need to move to PySpark or ADF mapping data flows to parallelize the groupby/join work, and the KPI aggregations would move from pandas into the warehouse layer (Synapse/Databricks SQL) instead of being computed in memory. Keeping each stage as its own function was a deliberate choice so that swap is a rewrite of individual pieces, not a redesign of the whole flow.</w:t>
       </w:r>
     </w:p>
     <w:p>
@@ -555,7 +563,7 @@
                 <w:sz w:val="20"/>
                 <w:szCs w:val="20"/>
               </w:rPr>
-              <w:t xml:space="preserve">1,000 rows. One-to-one with bookings in this dataset.</w:t>
+              <w:t xml:space="preserve">1,000 rows. One-to-many with bookings — 267 bookings have more than one payment row, mostly a failed/missing-amount attempt followed by a successful one.</w:t>
             </w:r>
           </w:p>
         </w:tc>
@@ -682,7 +690,7 @@
                 <w:sz w:val="20"/>
                 <w:szCs w:val="20"/>
               </w:rPr>
-              <w:t xml:space="preserve">41 rows</w:t>
+              <w:t xml:space="preserve">69 rows</w:t>
             </w:r>
           </w:p>
         </w:tc>
@@ -735,7 +743,7 @@
                 <w:sz w:val="20"/>
                 <w:szCs w:val="20"/>
               </w:rPr>
-              <w:t xml:space="preserve">16 rows shared a flight_id, but only exact duplicates (same id + departure + arrival) were dropped</w:t>
+              <w:t xml:space="preserve">15 rows shared a flight_id, but only exact duplicates (same id + departure + arrival) were dropped</w:t>
             </w:r>
           </w:p>
         </w:tc>
@@ -1000,7 +1008,7 @@
                 <w:sz w:val="20"/>
                 <w:szCs w:val="20"/>
               </w:rPr>
-              <w:t xml:space="preserve">48 rows</w:t>
+              <w:t xml:space="preserve">78 rows</w:t>
             </w:r>
           </w:p>
         </w:tc>

</xml_diff>